<commit_message>
feat(refluye): orientar desde primera lectura y mostrar ICA
</commit_message>
<xml_diff>
--- a/output/word/refluye-guia-app.docx
+++ b/output/word/refluye-guia-app.docx
@@ -7,7 +7,7 @@
         <w:pStyle w:val="Title"/>
       </w:pPr>
       <w:r>
-        <w:t>Re-Fluye 0.2.0  Guía de uso de la aplicación</w:t>
+        <w:t>Re-Fluye 0.3.0  Guía de uso de la aplicación</w:t>
       </w:r>
     </w:p>
     <w:p>
@@ -29,7 +29,7 @@
         <w:t>Edición:</w:t>
       </w:r>
       <w:r>
-        <w:t xml:space="preserve"> 27 de septiembre de 2026 · APK de pruebas, Android 7.0 o posterior.</w:t>
+        <w:t xml:space="preserve"> 30 de septiembre de 2026 · APK de pruebas, Android 7.0 o posterior.</w:t>
       </w:r>
     </w:p>
     <w:p>
@@ -102,7 +102,7 @@
           <w:rPr>
             <w:color w:val="007074"/>
           </w:rPr>
-          <w:t>versión de pruebas 0.2.0</w:t>
+          <w:t>versión de pruebas 0.3.0</w:t>
         </w:r>
       </w:hyperlink>
       <w:r>
@@ -122,10 +122,10 @@
           <w:rFonts w:ascii="Consolas" w:hAnsi="Consolas"/>
           <w:sz w:val="17"/>
         </w:rPr>
-        <w:t>refluye-campo-0.2.0-pruebas.apk</w:t>
+        <w:t>refluye-campo-0.3.0-pruebas.apk</w:t>
       </w:r>
       <w:r>
-        <w:t>. El archivo ocupa aproximadamente 52 MB.</w:t>
+        <w:t>.</w:t>
       </w:r>
     </w:p>
     <w:p>
@@ -188,7 +188,7 @@
         <w:t>Abrir</w:t>
       </w:r>
       <w:r>
-        <w:t>. Si ya usabas Re-Fluye 0.1.0, intenta instalar 0.2.0 encima, sin desinstalar la anterior. Ambas APK comparten identificador y certificado, pero la conservación del historial aún debe comprobarse en un teléfono. Si Android rechaza la actualización, no desinstales antes de consultar al equipo técnico.</w:t>
+        <w:t>. Si ya usabas Re-Fluye 0.1.0 o 0.2.0, intenta instalar 0.3.0 encima, sin desinstalar la anterior. Se conserva el identificador de paquete; la actualización y conservación del historial aún deben comprobarse en un teléfono. Si Android rechaza la actualización, no desinstales antes de consultar al equipo técnico.</w:t>
       </w:r>
     </w:p>
     <w:p>
@@ -207,17 +207,7 @@
         <w:t>.sha256</w:t>
       </w:r>
       <w:r>
-        <w:t xml:space="preserve"> incluido en Assets. La huella SHA-256 esperada es </w:t>
-      </w:r>
-      <w:r>
-        <w:rPr>
-          <w:rFonts w:ascii="Consolas" w:hAnsi="Consolas"/>
-          <w:sz w:val="17"/>
-        </w:rPr>
-        <w:t>5e7bb29e40282b3234344928271abe975a70a2b467f69214306741aba567beb2</w:t>
-      </w:r>
-      <w:r>
-        <w:t>.</w:t>
+        <w:t xml:space="preserve"> incluido en Assets. Compara la huella publicada allí con la que obtengas para la APK descargada.</w:t>
       </w:r>
     </w:p>
     <w:p>
@@ -273,16 +263,16 @@
         <w:t>DEMO · DATOS SIMULADOS</w:t>
       </w:r>
       <w:r>
-        <w:t xml:space="preserve"> identifica esta práctica. Espera a que aparezca </w:t>
+        <w:t xml:space="preserve"> identifica esta práctica. La primera lectura completa ya permite analizar; si varía, se identifica como </w:t>
       </w:r>
       <w:r>
         <w:rPr>
           <w:b/>
         </w:rPr>
-        <w:t>Lectura estable</w:t>
+        <w:t>inicial</w:t>
       </w:r>
       <w:r>
-        <w:t xml:space="preserve">, completa las preguntas y revisa el resultado. Las mediciones DEMO se guardan como práctica y </w:t>
+        <w:t xml:space="preserve">. Completa las preguntas y revisa el resultado. Las mediciones DEMO se guardan como práctica y </w:t>
       </w:r>
       <w:r>
         <w:rPr>
@@ -451,16 +441,25 @@
         <w:spacing w:after="100"/>
       </w:pPr>
       <w:r>
-        <w:t xml:space="preserve">Mantén las sondas quietas. La app espera cuatro tramas recientes y estables; el primer número no basta. Puedes tocar </w:t>
+        <w:t xml:space="preserve">Mantén las sondas quietas. Desde la primera trama completa y reciente aparece un </w:t>
       </w:r>
       <w:r>
         <w:rPr>
           <w:b/>
         </w:rPr>
-        <w:t>Ver las 4 lecturas del equipo</w:t>
+        <w:t>ICA orientativo de 0 a 100</w:t>
       </w:r>
       <w:r>
-        <w:t xml:space="preserve"> para revisar pH, turbidez, sólidos disueltos y temperatura. Si falta un sensor o la conexión se pierde, no fuerces la captura.</w:t>
+        <w:t xml:space="preserve"> y se ven pH, turbidez, sólidos disueltos y temperatura. El índice pondera los tres primeros parámetros; la temperatura se muestra como contexto porque no tiene un peso validado en la fórmula del proyecto. No es un porcentaje de potabilidad. Si la lectura varía, el resultado se marca </w:t>
+      </w:r>
+      <w:r>
+        <w:rPr>
+          <w:b/>
+        </w:rPr>
+        <w:t>inicial</w:t>
+      </w:r>
+      <w:r>
+        <w:t>. Si faltan datos esenciales o se pierde la conexión, no fuerces la captura.</w:t>
       </w:r>
     </w:p>
     <w:p>
@@ -565,10 +564,19 @@
         <w:rPr>
           <w:b/>
         </w:rPr>
-        <w:t>Ver análisis y recomendaciones</w:t>
+        <w:t>Ver qué puedo hacer con esta agua</w:t>
       </w:r>
       <w:r>
-        <w:t>. La app guarda la lectura, la observación y el resultado localmente, incluso sin internet.</w:t>
+        <w:t xml:space="preserve">. No necesitas esperar a que cuatro lecturas coincidan. La app guarda la lectura, la observación y el resultado localmente, incluso sin internet. Si la lectura es inicial, puede mostrar una ruta posible de tratamiento solo cuando los datos y la calibración están verificados, pero </w:t>
+      </w:r>
+      <w:r>
+        <w:rPr>
+          <w:b/>
+        </w:rPr>
+        <w:t>no autoriza consumir</w:t>
+      </w:r>
+      <w:r>
+        <w:t xml:space="preserve"> antes de una nueva comprobación.</w:t>
       </w:r>
     </w:p>
     <w:p>
@@ -581,7 +589,7 @@
     </w:p>
     <w:p>
       <w:r>
-        <w:t xml:space="preserve">Lee primero </w:t>
+        <w:t xml:space="preserve">Lee primero la decisión, </w:t>
       </w:r>
       <w:r>
         <w:rPr>
@@ -590,7 +598,7 @@
         <w:t>TU USO</w:t>
       </w:r>
       <w:r>
-        <w:t xml:space="preserve">, la instrucción principal y la advertencia de fiabilidad. Luego lee </w:t>
+        <w:t xml:space="preserve"> y </w:t>
       </w:r>
       <w:r>
         <w:rPr>
@@ -599,25 +607,16 @@
         <w:t>QUÉ HACER AHORA</w:t>
       </w:r>
       <w:r>
-        <w:t xml:space="preserve">. Abre </w:t>
+        <w:t xml:space="preserve">. Para beber o cocinar, los pasos de aclarado, hervor de </w:t>
       </w:r>
       <w:r>
         <w:rPr>
           <w:b/>
         </w:rPr>
-        <w:t>Ver cómo desinfectar / Ver cómo repetir / Ver qué hacer</w:t>
+        <w:t>3 minutos desde burbujas grandes y continuas</w:t>
       </w:r>
       <w:r>
-        <w:t xml:space="preserve"> si está disponible. La guía de hervor de la app cuenta </w:t>
-      </w:r>
-      <w:r>
-        <w:rPr>
-          <w:b/>
-        </w:rPr>
-        <w:t>3 minutos desde que hay burbujas grandes y continuas</w:t>
-      </w:r>
-      <w:r>
-        <w:t xml:space="preserve">; si se interrumpe, reinicia el temporizador. Antes del hervor, aclara el agua con partículas; si sigue turbia, detente y busca otra fuente. El hervor no elimina combustibles, químicos, metales, sales ni toxinas de algas. </w:t>
+        <w:t xml:space="preserve">, enfriado y almacenamiento están en la misma pantalla; puedes abrir el temporizador y la guía completa si los necesitas. Si se interrumpe el hervor, reinicia el temporizador. Antes del hervor, aclara el agua con partículas; si sigue turbia, detente y busca otra fuente. El hervor no elimina combustibles, químicos, metales, sales ni toxinas de algas. </w:t>
       </w:r>
       <w:hyperlink r:id="rId10">
         <w:r>
@@ -979,7 +978,7 @@
         <w:t>no confiable</w:t>
       </w:r>
       <w:r>
-        <w:t>. Una señal «Lectura estable» solo describe variación reciente, no exactitud.</w:t>
+        <w:t>. Una lectura repetida solo describe variación reciente, no exactitud.</w:t>
       </w:r>
     </w:p>
     <w:p>
@@ -1248,7 +1247,7 @@
               <w:rPr>
                 <w:sz w:val="17"/>
               </w:rPr>
-              <w:t>Falta lectura estable, nombre, uso u observación. Revisa el mensaje bajo las preguntas.</w:t>
+              <w:t>Falta una trama completa y reciente, nombre, uso u observación. Revisa el mensaje bajo las preguntas.</w:t>
             </w:r>
           </w:p>
         </w:tc>
@@ -1521,7 +1520,7 @@
       <w:rPr>
         <w:color w:val="56626A"/>
       </w:rPr>
-      <w:t>RE-FLUYE  ·  27 SEP 2026</w:t>
+      <w:t>RE-FLUYE  ·  30 SEP 2026</w:t>
     </w:r>
   </w:p>
 </w:ftr>

</xml_diff>

<commit_message>
fix(refluye): mostrar sensores Bluetooth en vivo
</commit_message>
<xml_diff>
--- a/output/word/refluye-guia-app.docx
+++ b/output/word/refluye-guia-app.docx
@@ -7,7 +7,7 @@
         <w:pStyle w:val="Title"/>
       </w:pPr>
       <w:r>
-        <w:t>Re-Fluye 0.3.0  Guía de uso de la aplicación</w:t>
+        <w:t>Re-Fluye 0.3.1  Guía de uso de la aplicación</w:t>
       </w:r>
     </w:p>
     <w:p>
@@ -29,7 +29,7 @@
         <w:t>Edición:</w:t>
       </w:r>
       <w:r>
-        <w:t xml:space="preserve"> 30 de septiembre de 2026 · APK de pruebas, Android 7.0 o posterior.</w:t>
+        <w:t xml:space="preserve"> 2 de octubre de 2026 · APK de pruebas, Android 7.0 o posterior.</w:t>
       </w:r>
     </w:p>
     <w:p>
@@ -102,7 +102,7 @@
           <w:rPr>
             <w:color w:val="007074"/>
           </w:rPr>
-          <w:t>versión de pruebas 0.3.0</w:t>
+          <w:t>versión de pruebas 0.3.1</w:t>
         </w:r>
       </w:hyperlink>
       <w:r>
@@ -122,7 +122,7 @@
           <w:rFonts w:ascii="Consolas" w:hAnsi="Consolas"/>
           <w:sz w:val="17"/>
         </w:rPr>
-        <w:t>refluye-campo-0.3.0-pruebas.apk</w:t>
+        <w:t>refluye-campo-0.3.1-pruebas.apk</w:t>
       </w:r>
       <w:r>
         <w:t>.</w:t>
@@ -188,7 +188,7 @@
         <w:t>Abrir</w:t>
       </w:r>
       <w:r>
-        <w:t>. Si ya usabas Re-Fluye 0.1.0 o 0.2.0, intenta instalar 0.3.0 encima, sin desinstalar la anterior. Se conserva el identificador de paquete; la actualización y conservación del historial aún deben comprobarse en un teléfono. Si Android rechaza la actualización, no desinstales antes de consultar al equipo técnico.</w:t>
+        <w:t>. Si ya usabas una versión anterior, intenta instalar 0.3.1 encima, sin desinstalarla. Se conserva el identificador de paquete; la actualización y conservación del historial aún deben comprobarse en un teléfono. Si Android rechaza la actualización, no desinstales antes de consultar al equipo técnico.</w:t>
       </w:r>
     </w:p>
     <w:p>
@@ -468,13 +468,40 @@
         <w:spacing w:after="100"/>
       </w:pPr>
       <w:r>
+        <w:t xml:space="preserve">Mira </w:t>
+      </w:r>
+      <w:r>
+        <w:rPr>
+          <w:b/>
+        </w:rPr>
+        <w:t>DATOS EN VIVO</w:t>
+      </w:r>
+      <w:r>
+        <w:t xml:space="preserve">: cada trama recibida actualiza los valores y las curvas de hasta 60 lecturas, sin esperar que se estabilicen. Cada curva tiene su propia escala. Si un sensor falta, los otros siguen visibles. Si transcurren cinco segundos sin datos, dejan de mostrarse como actuales. </w:t>
+      </w:r>
+      <w:r>
+        <w:rPr>
+          <w:b/>
+        </w:rPr>
+        <w:t>Ver datos recibidos por Bluetooth</w:t>
+      </w:r>
+      <w:r>
+        <w:t xml:space="preserve"> permite enseñar la última trama al técnico; un estado textual antiguo no bloquea los sensores.</w:t>
+      </w:r>
+    </w:p>
+    <w:p>
+      <w:pPr>
+        <w:pStyle w:val="ListNumber"/>
+        <w:spacing w:after="100"/>
+      </w:pPr>
+      <w:r>
         <w:t xml:space="preserve">En </w:t>
       </w:r>
       <w:r>
         <w:rPr>
           <w:b/>
         </w:rPr>
-        <w:t>Identifica la fuente</w:t>
+        <w:t>Nombra la fuente</w:t>
       </w:r>
       <w:r>
         <w:t>, escribe un nombre reconocible, por ejemplo «Quebrada de la finca». No introduzcas dirección precisa ni datos personales innecesarios.</w:t>
@@ -492,7 +519,7 @@
         <w:rPr>
           <w:b/>
         </w:rPr>
-        <w:t>¿Para qué la necesitas?</w:t>
+        <w:t>¿Para qué usarás el agua?</w:t>
       </w:r>
       <w:r>
         <w:t xml:space="preserve">, elige </w:t>
@@ -528,7 +555,7 @@
         <w:rPr>
           <w:b/>
         </w:rPr>
-        <w:t>Lo que observas</w:t>
+        <w:t>¿Qué notas en el agua?</w:t>
       </w:r>
       <w:r>
         <w:t xml:space="preserve">, elige si el agua corre o está quieta, si notas olor extraño y cómo se ve. Si marcas </w:t>
@@ -917,7 +944,7 @@
         <w:rPr>
           <w:b/>
         </w:rPr>
-        <w:t>Ver los números y observaciones</w:t>
+        <w:t>Ver detalles técnicos</w:t>
       </w:r>
       <w:r>
         <w:t xml:space="preserve"> muestra los datos que respaldan la evaluación. </w:t>
@@ -1197,6 +1224,57 @@
                 <w:sz w:val="17"/>
               </w:rPr>
               <w:t>Espera unos segundos; si persiste, reconecta y solicita revisión del firmware/protocolo.</w:t>
+            </w:r>
+          </w:p>
+        </w:tc>
+      </w:tr>
+      <w:tr>
+        <w:trPr>
+          <w:cantSplit/>
+        </w:trPr>
+        <w:tc>
+          <w:tcPr>
+            <w:tcW w:type="dxa" w:w="4873"/>
+            <w:vAlign w:val="center"/>
+            <w:tcMar>
+              <w:top w:w="85" w:type="dxa"/>
+              <w:start w:w="110" w:type="dxa"/>
+              <w:bottom w:w="85" w:type="dxa"/>
+              <w:end w:w="110" w:type="dxa"/>
+            </w:tcMar>
+          </w:tcPr>
+          <w:p>
+            <w:pPr>
+              <w:spacing w:after="0"/>
+            </w:pPr>
+            <w:r>
+              <w:rPr>
+                <w:sz w:val="17"/>
+              </w:rPr>
+              <w:t>Datos incompletos o error persistente</w:t>
+            </w:r>
+          </w:p>
+        </w:tc>
+        <w:tc>
+          <w:tcPr>
+            <w:tcW w:type="dxa" w:w="4873"/>
+            <w:vAlign w:val="center"/>
+            <w:tcMar>
+              <w:top w:w="85" w:type="dxa"/>
+              <w:start w:w="110" w:type="dxa"/>
+              <w:bottom w:w="85" w:type="dxa"/>
+              <w:end w:w="110" w:type="dxa"/>
+            </w:tcMar>
+          </w:tcPr>
+          <w:p>
+            <w:pPr>
+              <w:spacing w:after="0"/>
+            </w:pPr>
+            <w:r>
+              <w:rPr>
+                <w:sz w:val="17"/>
+              </w:rPr>
+              <w:t>Abre «Ver datos recibidos por Bluetooth» y comunica la trama al soporte. Confirma que instalaste 0.3.1.</w:t>
             </w:r>
           </w:p>
         </w:tc>
@@ -1520,7 +1598,7 @@
       <w:rPr>
         <w:color w:val="56626A"/>
       </w:rPr>
-      <w:t>RE-FLUYE  ·  30 SEP 2026</w:t>
+      <w:t>RE-FLUYE  ·  02 OCT 2026</w:t>
     </w:r>
   </w:p>
 </w:ftr>

</xml_diff>